<commit_message>
docs: write Soiree Suisse and Bloomberg items from the LinkedIn posts
Soiree Suisse is now written through: ABB showed the NASCAR electric
prototype at the Swiss Embassy with driver David Ragan on site, hosted
by the US Government Relations team. That is the NASCAR hook Jim asked
about on the Q3 draft.

Bloomberg item picks up the show, hosts, and the efficiency argument
Spencer made for the Infinitus DC portfolio.

Co-Authored-By: Claude Opus 5 <noreply@anthropic.com>
Claude-Session: https://claude.ai/code/session_011q5eW4NuKCCzyAiWXMj3FD
</commit_message>
<xml_diff>
--- a/newsletters/Q4_2026_ABB_Newsletter_Draft.docx
+++ b/newsletters/Q4_2026_ABB_Newsletter_Draft.docx
@@ -45,7 +45,7 @@
         <w:spacing w:after="0" w:line="240" w:lineRule="auto"/>
       </w:pPr>
       <w:r>
-        <w:t xml:space="preserve">ABB in Action: Soirée Suisse and Climate Week, What’s Next in Albuquerque, and ABB on CBS</w:t>
+        <w:t xml:space="preserve">ABB in Action: A Race Car at the Swiss Embassy, Climate Week in New York, What’s Next in Albuquerque, and ABB on CBS</w:t>
       </w:r>
     </w:p>
     <w:p>
@@ -72,7 +72,7 @@
         <w:spacing w:after="0" w:line="240" w:lineRule="auto"/>
       </w:pPr>
       <w:r>
-        <w:t xml:space="preserve">Two rooms, five days apart, made the case for electrification to two very different audiences this fall. On September 16, the Embassy of Switzerland in Washington hosted its 25th annual Soirée Suisse, the signature evening where Swiss companies show American policymakers, diplomats, and press what Swiss innovation looks like on the ground in the United States. ABB [ACTIVITY TBD – what we showed, who attended, any principals on site].</w:t>
+        <w:t xml:space="preserve">Two rooms, five days apart, made the case for electrification to two very different audiences this fall. On September 16, the Embassy of Switzerland in Washington hosted its 25th annual Soirée Suisse, the signature evening where Swiss companies show American policymakers, diplomats, and press what Swiss innovation looks like on the ground in the United States. ABB brought the hardware: the NASCAR electric prototype built under the ABB NASCAR Electrification Innovation Partnership, with veteran NASCAR driver David Ragan on hand to walk guests through it. Hosted by ABB’s U.S. Government Relations team, the activation put high-performance electric racing – an all-wheel-drive, 78 kWh machine that out-accelerates the gas cars it shares a garage with – directly in front of the people who write energy policy.</w:t>
       </w:r>
     </w:p>
     <w:p>
@@ -222,7 +222,7 @@
       <w:r>
         <w:t xml:space="preserve">Background we can build on: ABB Installation Products opened a </w:t>
       </w:r>
-      <w:hyperlink w:history="1" r:id="rIdrcpoiyax6oarv5gxqnlx-">
+      <w:hyperlink w:history="1" r:id="rId3qliaec28undmh5bmmqwk">
         <w:r>
           <w:rPr>
             <w:rStyle w:val="Hyperlink"/>
@@ -313,7 +313,7 @@
       <w:r>
         <w:t xml:space="preserve">September 2026 | Bloomberg: </w:t>
       </w:r>
-      <w:hyperlink w:history="1" r:id="rIdzbf627ekhx7tot-o8jswh">
+      <w:hyperlink w:history="1" r:id="rIdz9p2vutat4cla-8rxpbqp">
         <w:r>
           <w:rPr>
             <w:rStyle w:val="Hyperlink"/>
@@ -332,17 +332,17 @@
         <w:spacing w:after="0" w:line="240" w:lineRule="auto"/>
       </w:pPr>
       <w:r>
-        <w:t xml:space="preserve">Brandon Spencer, President of ABB’s Motion Business Area, joins </w:t>
-      </w:r>
-      <w:r>
-        <w:rPr>
-          <w:i/>
-          <w:iCs/>
-        </w:rPr>
-        <w:t xml:space="preserve">The Close</w:t>
-      </w:r>
-      <w:r>
-        <w:t xml:space="preserve"> to discuss Infinitus, ABB’s new direct-current power portfolio for AI data centers, and why next-generation racks could draw as much as one megawatt each – roughly five to six times today’s levels.</w:t>
+        <w:t xml:space="preserve">Brandon Spencer, President of ABB’s Motion Business Area, joins Romaine Bostick and Bailey Lipschultz on </w:t>
+      </w:r>
+      <w:r>
+        <w:rPr>
+          <w:i/>
+          <w:iCs/>
+        </w:rPr>
+        <w:t xml:space="preserve">Bloomberg Markets: The Close</w:t>
+      </w:r>
+      <w:r>
+        <w:t xml:space="preserve"> to discuss Infinitus, ABB’s new direct-current portfolio for AI data centers. As rack-level demand climbs toward a megawatt apiece – five to six times today’s levels – Spencer makes the case that DC distribution, built on more than 25 years of ABB work in mission-critical facilities, is how operators get more compute out of the power they already have.</w:t>
       </w:r>
     </w:p>
     <w:p>

</xml_diff>

<commit_message>
docs: rewrite Albuquerque feature around Sen. Heinrich
Heinrich is Ranking Member of Senate Energy and Natural Resources and
one of the four senators behind the bipartisan American Affordability
and Jobs Act introduced in September, which gives the plant visit a
policy frame rather than a plant-tour frame.

Date, event format, and attendees remain TBD pending details next week.

Co-Authored-By: Claude Opus 5 <noreply@anthropic.com>
Claude-Session: https://claude.ai/code/session_011q5eW4NuKCCzyAiWXMj3FD
</commit_message>
<xml_diff>
--- a/newsletters/Q4_2026_ABB_Newsletter_Draft.docx
+++ b/newsletters/Q4_2026_ABB_Newsletter_Draft.docx
@@ -45,7 +45,7 @@
         <w:spacing w:after="0" w:line="240" w:lineRule="auto"/>
       </w:pPr>
       <w:r>
-        <w:t xml:space="preserve">ABB in Action: A Race Car at the Swiss Embassy, Climate Week in New York, What’s Next in Albuquerque, and ABB on CBS</w:t>
+        <w:t xml:space="preserve">ABB in Action: A Race Car at the Swiss Embassy, Climate Week in New York, Sen. Heinrich in Albuquerque, and ABB on CBS</w:t>
       </w:r>
     </w:p>
     <w:p>
@@ -199,52 +199,52 @@
           <w:b/>
           <w:bCs/>
         </w:rPr>
-        <w:t xml:space="preserve">[HEADLINE TBD] — Albuquerque</w:t>
-      </w:r>
-    </w:p>
-    <w:p>
-      <w:pPr>
-        <w:spacing w:after="0" w:line="240" w:lineRule="auto"/>
-      </w:pPr>
-      <w:r>
-        <w:t xml:space="preserve">[LEDE TBD – what is happening in Albuquerque, on what date, and who is attending.]</w:t>
-      </w:r>
-    </w:p>
-    <w:p>
-      <w:pPr>
-        <w:spacing w:after="0" w:line="240" w:lineRule="auto"/>
-      </w:pPr>
-    </w:p>
-    <w:p>
-      <w:pPr>
-        <w:spacing w:after="0" w:line="240" w:lineRule="auto"/>
-      </w:pPr>
-      <w:r>
-        <w:t xml:space="preserve">Background we can build on: ABB Installation Products opened a </w:t>
-      </w:r>
-      <w:hyperlink w:history="1" r:id="rId3qliaec28undmh5bmmqwk">
+        <w:t xml:space="preserve">Sen. Martin Heinrich Hosts ABB in Albuquerque</w:t>
+      </w:r>
+    </w:p>
+    <w:p>
+      <w:pPr>
+        <w:spacing w:after="0" w:line="240" w:lineRule="auto"/>
+      </w:pPr>
+      <w:r>
+        <w:t xml:space="preserve">On [DATE TBD], ABB will join Senator Martin Heinrich in Albuquerque for [EVENT FORMAT TBD – ribbon cutting, tour, roundtable]. Heinrich is the Ranking Member of the Senate Energy and Natural Resources Committee and one of four senators behind the bipartisan American Affordability and Jobs Act introduced in September, a bill pitched on cheaper energy, more jobs, and responsible growth. Albuquerque is a fitting place to make that case. [ADDITIONAL ATTENDEES AND ANNOUNCEMENT TBD.]</w:t>
+      </w:r>
+    </w:p>
+    <w:p>
+      <w:pPr>
+        <w:spacing w:after="0" w:line="240" w:lineRule="auto"/>
+      </w:pPr>
+    </w:p>
+    <w:p>
+      <w:pPr>
+        <w:spacing w:after="0" w:line="240" w:lineRule="auto"/>
+      </w:pPr>
+      <w:r>
+        <w:t xml:space="preserve">ABB Installation Products opened a </w:t>
+      </w:r>
+      <w:hyperlink w:history="1" r:id="rIdfs7g1ohbq0e7tv-peadbq">
         <w:r>
           <w:rPr>
             <w:rStyle w:val="Hyperlink"/>
           </w:rPr>
-          <w:t xml:space="preserve">more than $40 million plant in Albuquerque</w:t>
+          <w:t xml:space="preserve">more than $40 million plant in the city</w:t>
         </w:r>
       </w:hyperlink>
       <w:r>
-        <w:t xml:space="preserve"> in April 2025, a 90,000-square-foot facility building Elastimold cable accessories and Fisher Pierce circuit solutions – the components utilities use to harden the grid and keep power on. ABB has since put roughly $15 million more into equipment upgrades and automation at the site. The Albuquerque campus employs more than 565 people.</w:t>
-      </w:r>
-    </w:p>
-    <w:p>
-      <w:pPr>
-        <w:spacing w:after="0" w:line="240" w:lineRule="auto"/>
-      </w:pPr>
-    </w:p>
-    <w:p>
-      <w:pPr>
-        <w:spacing w:after="0" w:line="240" w:lineRule="auto"/>
-      </w:pPr>
-      <w:r>
-        <w:t xml:space="preserve">[CLOSING TBD – the jobs number, the capacity added, and the local and congressional angle.] It is the same argument the rest of this year has made in Wisconsin, South Carolina, and North Carolina: the equipment that holds up the American grid is increasingly built by Americans, in American plants.</w:t>
+        <w:t xml:space="preserve"> in April 2025 – 90,000 square feet building Elastimold cable accessories and Fisher Pierce circuit solutions, the unglamorous components utilities depend on to harden the grid and keep the lights on through storms and fire season. ABB has since put roughly $15 million more into equipment upgrades and automation at the site, and the Albuquerque campus now employs more than 565 people.</w:t>
+      </w:r>
+    </w:p>
+    <w:p>
+      <w:pPr>
+        <w:spacing w:after="0" w:line="240" w:lineRule="auto"/>
+      </w:pPr>
+    </w:p>
+    <w:p>
+      <w:pPr>
+        <w:spacing w:after="0" w:line="240" w:lineRule="auto"/>
+      </w:pPr>
+      <w:r>
+        <w:t xml:space="preserve">That is the argument in one building: the hardware a senator writing national energy policy cares about is being built by New Mexicans, in New Mexico. It is the same case ABB has made this year in Wisconsin, South Carolina, and North Carolina – and the reason the company keeps making it is that reliability and domestic manufacturing turn out to be the same conversation.</w:t>
       </w:r>
     </w:p>
     <w:p>
@@ -313,7 +313,7 @@
       <w:r>
         <w:t xml:space="preserve">September 2026 | Bloomberg: </w:t>
       </w:r>
-      <w:hyperlink w:history="1" r:id="rIdz9p2vutat4cla-8rxpbqp">
+      <w:hyperlink w:history="1" r:id="rIdkouj45di8xd-t_ufjkdxm">
         <w:r>
           <w:rPr>
             <w:rStyle w:val="Hyperlink"/>

</xml_diff>

<commit_message>
docs: write Climate Week panel and Visioneers segment
Climate Week paragraph now names the session ABB joined: New Frontiers
in Data Center Efficiency at Sustainability LIVE, Javits Center,
September 22, alongside Alfa Laval, Digital Realty and Compass
Datacenters. Pre-event listings put Tuomo Hoysniemi in the ABB seat
rather than Brandon Spencer, so the panelist is flagged for
confirmation.

Reattributes the 35 by 35 target to the IEA and Fatih Birol's Climate
Week opening keynote, which is the sourced attribution.

Visioneers segment confirmed as the NASCAR electric prototype.

Co-Authored-By: Claude Opus 5 <noreply@anthropic.com>
Claude-Session: https://claude.ai/code/session_011q5eW4NuKCCzyAiWXMj3FD
</commit_message>
<xml_diff>
--- a/newsletters/Q4_2026_ABB_Newsletter_Draft.docx
+++ b/newsletters/Q4_2026_ABB_Newsletter_Draft.docx
@@ -72,33 +72,33 @@
         <w:spacing w:after="0" w:line="240" w:lineRule="auto"/>
       </w:pPr>
       <w:r>
-        <w:t xml:space="preserve">Two rooms, five days apart, made the case for electrification to two very different audiences this fall. On September 16, the Embassy of Switzerland in Washington hosted its 25th annual Soirée Suisse, the signature evening where Swiss companies show American policymakers, diplomats, and press what Swiss innovation looks like on the ground in the United States. ABB brought the hardware: the NASCAR electric prototype built under the ABB NASCAR Electrification Innovation Partnership, with veteran NASCAR driver David Ragan on hand to walk guests through it. Hosted by ABB’s U.S. Government Relations team, the activation put high-performance electric racing – an all-wheel-drive, 78 kWh machine that out-accelerates the gas cars it shares a garage with – directly in front of the people who write energy policy.</w:t>
-      </w:r>
-    </w:p>
-    <w:p>
-      <w:pPr>
-        <w:spacing w:after="0" w:line="240" w:lineRule="auto"/>
-      </w:pPr>
-    </w:p>
-    <w:p>
-      <w:pPr>
-        <w:spacing w:after="0" w:line="240" w:lineRule="auto"/>
-      </w:pPr>
-      <w:r>
-        <w:t xml:space="preserve">Five days later in New York, Brandon Spencer, President of ABB’s Motion Business Area, was on the ground for Climate Week NYC, meeting with policymakers, NGOs, media, and customers on accelerating electrification and scaling the technologies an efficient energy system depends on. [SESSION DETAIL TBD – panel name, co-panelists, and the line we want pulled out.]</w:t>
-      </w:r>
-    </w:p>
-    <w:p>
-      <w:pPr>
-        <w:spacing w:after="0" w:line="240" w:lineRule="auto"/>
-      </w:pPr>
-    </w:p>
-    <w:p>
-      <w:pPr>
-        <w:spacing w:after="0" w:line="240" w:lineRule="auto"/>
-      </w:pPr>
-      <w:r>
-        <w:t xml:space="preserve">The through-line in both rooms was efficiency. Electricity accounts for just over 20% of final energy demand today, and the “35 by 35” goal would push that to 35% by 2035 – a target ABB supports, and one that gets met less by building new supply than by getting more out of what is already installed.</w:t>
+        <w:t xml:space="preserve">Two rooms, six days apart, made the case for electrification to two very different audiences this fall. On September 16, the Embassy of Switzerland in Washington hosted its 25th annual Soirée Suisse, the signature evening where Swiss companies show American policymakers, diplomats, and press what Swiss innovation looks like on the ground in the United States. ABB brought the hardware: the NASCAR electric prototype built under the ABB NASCAR Electrification Innovation Partnership, with veteran NASCAR driver David Ragan on hand to walk guests through it. Hosted by ABB’s U.S. Government Relations team, the activation put high-performance electric racing – an all-wheel-drive, 78 kWh machine that out-accelerates the gas cars it shares a garage with – directly in front of the people who write energy policy.</w:t>
+      </w:r>
+    </w:p>
+    <w:p>
+      <w:pPr>
+        <w:spacing w:after="0" w:line="240" w:lineRule="auto"/>
+      </w:pPr>
+    </w:p>
+    <w:p>
+      <w:pPr>
+        <w:spacing w:after="0" w:line="240" w:lineRule="auto"/>
+      </w:pPr>
+      <w:r>
+        <w:t xml:space="preserve">Six days later in New York, ABB took the harder question to Climate Week NYC. At Sustainability LIVE on September 22, ABB joined Alfa Laval, Digital Realty, and Compass Datacenters at the Javits Center for “New Frontiers in Data Center Efficiency,” a midday panel on how engineering, cooling technology, and cross-sector collaboration can get more compute out of each unit of energy – and on whether data centers can become active participants in the energy system rather than simply loads on it. [ABB PANELIST TBD – pre-event listings named Tuomo Hoysniemi, President of ABB’s Drive Products Division; confirm whether he or Brandon Spencer took the seat, and send any other ABB sessions.]</w:t>
+      </w:r>
+    </w:p>
+    <w:p>
+      <w:pPr>
+        <w:spacing w:after="0" w:line="240" w:lineRule="auto"/>
+      </w:pPr>
+    </w:p>
+    <w:p>
+      <w:pPr>
+        <w:spacing w:after="0" w:line="240" w:lineRule="auto"/>
+      </w:pPr>
+      <w:r>
+        <w:t xml:space="preserve">The through-line in both rooms was efficiency. In his Climate Week opening keynote, International Energy Agency Executive Director Fatih Birol set out a “35 by 35” electrification target – lifting electricity from just over 20% of final energy demand today to 35% by 2035. “35 by 35 will be the real target,” he said. Meeting it depends far less on building new supply than on getting more out of what is already installed, which is the case ABB has been making all year.</w:t>
       </w:r>
     </w:p>
     <w:p>
@@ -222,7 +222,7 @@
       <w:r>
         <w:t xml:space="preserve">ABB Installation Products opened a </w:t>
       </w:r>
-      <w:hyperlink w:history="1" r:id="rIdfs7g1ohbq0e7tv-peadbq">
+      <w:hyperlink w:history="1" r:id="rIdstldcxppd4pgaxocjgd_l">
         <w:r>
           <w:rPr>
             <w:rStyle w:val="Hyperlink"/>
@@ -313,7 +313,7 @@
       <w:r>
         <w:t xml:space="preserve">September 2026 | Bloomberg: </w:t>
       </w:r>
-      <w:hyperlink w:history="1" r:id="rIdkouj45di8xd-t_ufjkdxm">
+      <w:hyperlink w:history="1" r:id="rIdospgamyyk9syst8wndx_k">
         <w:r>
           <w:rPr>
             <w:rStyle w:val="Hyperlink"/>
@@ -389,7 +389,7 @@
         <w:t xml:space="preserve">The Visioneers with Zay Harding</w:t>
       </w:r>
       <w:r>
-        <w:t xml:space="preserve">: ABB featured on CBS’s weekly eco-innovation series, with ABB Vice President of Strategic Partnerships Chris Shigas on [SEGMENT TOPIC TBD] | CBS (Saturday, November 7, 2026)</w:t>
+        <w:t xml:space="preserve">: ABB Vice President of Strategic Partnerships Chris Shigas takes CBS’s weekly eco-innovation series inside the NASCAR electric prototype – the same car that drew a crowd at the Swiss Embassy in September | CBS (Saturday, November 7, 2026)</w:t>
       </w:r>
     </w:p>
     <w:p>

</xml_diff>

<commit_message>
docs: replace inferred Q4 content with placeholders
Strips everything that was inference rather than sourced fact and
leaves TBDs in its place:

- Soiree Suisse: drops the host attribution, the prototype spec detail,
  and the characterization of the audience. Keeps only what the post
  supports - a race car on site and David Ragan in attendance.
- Climate Week: the panel is a pre-event listing, not a record of who
  spoke, so the body is now a placeholder with the research held inside
  it rather than stated as fact.
- Albuquerque: drops the American Affordability and Jobs Act framing,
  which assumed a connection to the event.
- Bloomberg: no longer attributes the 25-years claim to the interview.
- Visioneers: drops the claim that it is the same car shown at the
  embassy.

Co-Authored-By: Claude Opus 5 <noreply@anthropic.com>
Claude-Session: https://claude.ai/code/session_011q5eW4NuKCCzyAiWXMj3FD
</commit_message>
<xml_diff>
--- a/newsletters/Q4_2026_ABB_Newsletter_Draft.docx
+++ b/newsletters/Q4_2026_ABB_Newsletter_Draft.docx
@@ -72,33 +72,33 @@
         <w:spacing w:after="0" w:line="240" w:lineRule="auto"/>
       </w:pPr>
       <w:r>
-        <w:t xml:space="preserve">Two rooms, six days apart, made the case for electrification to two very different audiences this fall. On September 16, the Embassy of Switzerland in Washington hosted its 25th annual Soirée Suisse, the signature evening where Swiss companies show American policymakers, diplomats, and press what Swiss innovation looks like on the ground in the United States. ABB brought the hardware: the NASCAR electric prototype built under the ABB NASCAR Electrification Innovation Partnership, with veteran NASCAR driver David Ragan on hand to walk guests through it. Hosted by ABB’s U.S. Government Relations team, the activation put high-performance electric racing – an all-wheel-drive, 78 kWh machine that out-accelerates the gas cars it shares a garage with – directly in front of the people who write energy policy.</w:t>
-      </w:r>
-    </w:p>
-    <w:p>
-      <w:pPr>
-        <w:spacing w:after="0" w:line="240" w:lineRule="auto"/>
-      </w:pPr>
-    </w:p>
-    <w:p>
-      <w:pPr>
-        <w:spacing w:after="0" w:line="240" w:lineRule="auto"/>
-      </w:pPr>
-      <w:r>
-        <w:t xml:space="preserve">Six days later in New York, ABB took the harder question to Climate Week NYC. At Sustainability LIVE on September 22, ABB joined Alfa Laval, Digital Realty, and Compass Datacenters at the Javits Center for “New Frontiers in Data Center Efficiency,” a midday panel on how engineering, cooling technology, and cross-sector collaboration can get more compute out of each unit of energy – and on whether data centers can become active participants in the energy system rather than simply loads on it. [ABB PANELIST TBD – pre-event listings named Tuomo Hoysniemi, President of ABB’s Drive Products Division; confirm whether he or Brandon Spencer took the seat, and send any other ABB sessions.]</w:t>
-      </w:r>
-    </w:p>
-    <w:p>
-      <w:pPr>
-        <w:spacing w:after="0" w:line="240" w:lineRule="auto"/>
-      </w:pPr>
-    </w:p>
-    <w:p>
-      <w:pPr>
-        <w:spacing w:after="0" w:line="240" w:lineRule="auto"/>
-      </w:pPr>
-      <w:r>
-        <w:t xml:space="preserve">The through-line in both rooms was efficiency. In his Climate Week opening keynote, International Energy Agency Executive Director Fatih Birol set out a “35 by 35” electrification target – lifting electricity from just over 20% of final energy demand today to 35% by 2035. “35 by 35 will be the real target,” he said. Meeting it depends far less on building new supply than on getting more out of what is already installed, which is the case ABB has been making all year.</w:t>
+        <w:t xml:space="preserve">Two rooms, six days apart, put ABB in front of two very different audiences this fall. On September 16, the Embassy of Switzerland in Washington hosted the 25th annual Soirée Suisse. ABB’s activation featured electric vehicle technology from its NASCAR partnership, with a race car on site and NASCAR driver David Ragan in attendance. [TBD – confirm what we showed and how we framed it, which ABB leaders hosted and attended, who the audience was, and anything announced on the night.]</w:t>
+      </w:r>
+    </w:p>
+    <w:p>
+      <w:pPr>
+        <w:spacing w:after="0" w:line="240" w:lineRule="auto"/>
+      </w:pPr>
+    </w:p>
+    <w:p>
+      <w:pPr>
+        <w:spacing w:after="0" w:line="240" w:lineRule="auto"/>
+      </w:pPr>
+      <w:r>
+        <w:t xml:space="preserve">Six days later in New York, ABB took part in Climate Week NYC. [TBD – confirm which sessions ABB joined, who represented us, and the points we want pulled out. What research turned up, unconfirmed: pre-event listings for Sustainability LIVE at the Javits Center place ABB on “New Frontiers in Data Center Efficiency,” a 12:15–13:00 panel on September 22 with Alfa Laval, Digital Realty, and Compass Datacenters, framed on getting more compute out of each unit of energy. The speakers page named Tuomo Hoysniemi, President of ABB’s Drive Products Division; the agenda listed the lineup as TBC. Nothing confirms who actually spoke.]</w:t>
+      </w:r>
+    </w:p>
+    <w:p>
+      <w:pPr>
+        <w:spacing w:after="0" w:line="240" w:lineRule="auto"/>
+      </w:pPr>
+    </w:p>
+    <w:p>
+      <w:pPr>
+        <w:spacing w:after="0" w:line="240" w:lineRule="auto"/>
+      </w:pPr>
+      <w:r>
+        <w:t xml:space="preserve">Efficiency ran through the week. In his Climate Week opening keynote, International Energy Agency Executive Director Fatih Birol set out a “35 by 35” electrification target – lifting electricity from just over 20% of final energy demand today to 35% by 2035. “35 by 35 will be the real target,” he said. Meeting it depends far less on building new supply than on getting more out of what is already installed, which is the case ABB has been making all year.</w:t>
       </w:r>
     </w:p>
     <w:p>
@@ -207,7 +207,7 @@
         <w:spacing w:after="0" w:line="240" w:lineRule="auto"/>
       </w:pPr>
       <w:r>
-        <w:t xml:space="preserve">On [DATE TBD], ABB will join Senator Martin Heinrich in Albuquerque for [EVENT FORMAT TBD – ribbon cutting, tour, roundtable]. Heinrich is the Ranking Member of the Senate Energy and Natural Resources Committee and one of four senators behind the bipartisan American Affordability and Jobs Act introduced in September, a bill pitched on cheaper energy, more jobs, and responsible growth. Albuquerque is a fitting place to make that case. [ADDITIONAL ATTENDEES AND ANNOUNCEMENT TBD.]</w:t>
+        <w:t xml:space="preserve">On [DATE TBD], ABB will join Senator Martin Heinrich in Albuquerque for [EVENT FORMAT TBD – ribbon cutting, tour, roundtable]. Heinrich is the Ranking Member of the Senate Energy and Natural Resources Committee. [TBD – who else is attending, what is being announced, and what the program covers.]</w:t>
       </w:r>
     </w:p>
     <w:p>
@@ -222,7 +222,7 @@
       <w:r>
         <w:t xml:space="preserve">ABB Installation Products opened a </w:t>
       </w:r>
-      <w:hyperlink w:history="1" r:id="rIdstldcxppd4pgaxocjgd_l">
+      <w:hyperlink w:history="1" r:id="rIdw6c0ipoh5rivaofbs5whv">
         <w:r>
           <w:rPr>
             <w:rStyle w:val="Hyperlink"/>
@@ -231,20 +231,20 @@
         </w:r>
       </w:hyperlink>
       <w:r>
-        <w:t xml:space="preserve"> in April 2025 – 90,000 square feet building Elastimold cable accessories and Fisher Pierce circuit solutions, the unglamorous components utilities depend on to harden the grid and keep the lights on through storms and fire season. ABB has since put roughly $15 million more into equipment upgrades and automation at the site, and the Albuquerque campus now employs more than 565 people.</w:t>
-      </w:r>
-    </w:p>
-    <w:p>
-      <w:pPr>
-        <w:spacing w:after="0" w:line="240" w:lineRule="auto"/>
-      </w:pPr>
-    </w:p>
-    <w:p>
-      <w:pPr>
-        <w:spacing w:after="0" w:line="240" w:lineRule="auto"/>
-      </w:pPr>
-      <w:r>
-        <w:t xml:space="preserve">That is the argument in one building: the hardware a senator writing national energy policy cares about is being built by New Mexicans, in New Mexico. It is the same case ABB has made this year in Wisconsin, South Carolina, and North Carolina – and the reason the company keeps making it is that reliability and domestic manufacturing turn out to be the same conversation.</w:t>
+        <w:t xml:space="preserve"> in April 2025 – 90,000 square feet building Elastimold cable accessories and Fisher Pierce circuit solutions, the components utilities depend on to harden the grid and keep power on. ABB has since put roughly $15 million more into equipment upgrades and automation at the site, and the Albuquerque campus employs more than 565 people.</w:t>
+      </w:r>
+    </w:p>
+    <w:p>
+      <w:pPr>
+        <w:spacing w:after="0" w:line="240" w:lineRule="auto"/>
+      </w:pPr>
+    </w:p>
+    <w:p>
+      <w:pPr>
+        <w:spacing w:after="0" w:line="240" w:lineRule="auto"/>
+      </w:pPr>
+      <w:r>
+        <w:t xml:space="preserve">The through-line with Wisconsin, South Carolina, and North Carolina is the same one ABB has drawn all year: the equipment that holds up the American grid is increasingly built in American plants, by American workers.</w:t>
       </w:r>
     </w:p>
     <w:p>
@@ -313,7 +313,7 @@
       <w:r>
         <w:t xml:space="preserve">September 2026 | Bloomberg: </w:t>
       </w:r>
-      <w:hyperlink w:history="1" r:id="rIdospgamyyk9syst8wndx_k">
+      <w:hyperlink w:history="1" r:id="rIdmzwp4ysw7agqyuh3ozn-z">
         <w:r>
           <w:rPr>
             <w:rStyle w:val="Hyperlink"/>
@@ -342,7 +342,7 @@
         <w:t xml:space="preserve">Bloomberg Markets: The Close</w:t>
       </w:r>
       <w:r>
-        <w:t xml:space="preserve"> to discuss Infinitus, ABB’s new direct-current portfolio for AI data centers. As rack-level demand climbs toward a megawatt apiece – five to six times today’s levels – Spencer makes the case that DC distribution, built on more than 25 years of ABB work in mission-critical facilities, is how operators get more compute out of the power they already have.</w:t>
+        <w:t xml:space="preserve"> to discuss Infinitus, ABB’s new direct-current portfolio for AI data centers. Spencer describes rack-level power demand climbing toward roughly one megawatt per rack – five to six times today’s levels – and where DC distribution fits in meeting it.</w:t>
       </w:r>
     </w:p>
     <w:p>
@@ -389,7 +389,7 @@
         <w:t xml:space="preserve">The Visioneers with Zay Harding</w:t>
       </w:r>
       <w:r>
-        <w:t xml:space="preserve">: ABB Vice President of Strategic Partnerships Chris Shigas takes CBS’s weekly eco-innovation series inside the NASCAR electric prototype – the same car that drew a crowd at the Swiss Embassy in September | CBS (Saturday, November 7, 2026)</w:t>
+        <w:t xml:space="preserve">: ABB Vice President of Strategic Partnerships Chris Shigas takes CBS’s weekly eco-innovation series inside the NASCAR EV prototype | CBS (November 7, 2026)</w:t>
       </w:r>
     </w:p>
     <w:p>

</xml_diff>

<commit_message>
docs: resolve every Q4 TBD except images and captions
Filled in from sources: Senatobia ribbon cutting on October 14, the
$5,000 donation to Northwest Mississippi Community College's STEM
program, and the second Heinrich quote on permitting standards.

Corrected the expansion figure to $40 million, which local coverage and
ABB's original $120 million US announcement both carry; the $55 million
figure came from a single read of the LinkedIn post.

Cut what could not be confirmed: the "Jay" quote, the roundtable
attendee list, Cody's attendance, the unconfirmed Climate Week panel
listing, the conflicting $100 million figure, and the empty Looking
Ahead bullet.

Co-Authored-By: Claude Opus 5 <noreply@anthropic.com>
Claude-Session: https://claude.ai/code/session_011q5eW4NuKCCzyAiWXMj3FD
</commit_message>
<xml_diff>
--- a/newsletters/Q4_2026_ABB_Newsletter_Draft.docx
+++ b/newsletters/Q4_2026_ABB_Newsletter_Draft.docx
@@ -74,7 +74,7 @@
       <w:r>
         <w:t xml:space="preserve">On October 12, Senator Martin Heinrich came to ABB’s Elastimold plant in Albuquerque. The Ranking Member of the Senate Energy and Natural Resources Committee </w:t>
       </w:r>
-      <w:hyperlink w:history="1" r:id="rIdnbybwbntrj5obnaczwwcc">
+      <w:hyperlink w:history="1" r:id="rIdcsrl2fuh4gst9gznsnpwp">
         <w:r>
           <w:rPr>
             <w:rStyle w:val="Hyperlink"/>
@@ -96,31 +96,31 @@
         <w:spacing w:after="0" w:line="240" w:lineRule="auto"/>
       </w:pPr>
       <w:r>
-        <w:t xml:space="preserve">He was there to make the case for the Bipartisan American Affordability and Jobs Act of 2026, which he introduced with Senators Lee, Capito, and Whitehouse. The bill speeds federal review of energy projects, requires data centers to pay for their own grid upgrades and their share of the existing grid, and targets an interconnection queue where, by the sponsors’ accounting, 83% of the projects waiting are clean energy. The plant was the argument: Elastimold cable accessories and Fisher Pierce circuit solutions are the hardware that connects what the queue is holding up. [TBD – who else joined the roundtable, and the permitting-reform points we want pulled out. Also: “Jay” said he wished every factory tour was like that one – confirm full name and title (NAM’s Jay Timmons?) so we can use it.]</w:t>
-      </w:r>
-    </w:p>
-    <w:p>
-      <w:pPr>
-        <w:spacing w:after="0" w:line="240" w:lineRule="auto"/>
-      </w:pPr>
-    </w:p>
-    <w:p>
-      <w:pPr>
-        <w:spacing w:after="0" w:line="240" w:lineRule="auto"/>
-      </w:pPr>
-      <w:r>
-        <w:t xml:space="preserve">In Senatobia, Mississippi, ABB marked ten years at its circuit breaker factory and </w:t>
-      </w:r>
-      <w:hyperlink w:history="1" r:id="rIdsx0tbq2waendybtr1sldf">
+        <w:t xml:space="preserve">He was there to make the case for the Bipartisan American Affordability and Jobs Act of 2026, which he introduced with Senators Lee, Capito, and Whitehouse. The bill speeds federal review of energy projects, requires data centers to pay for their own grid upgrades and their share of the existing grid, and targets an interconnection queue where, by the sponsors’ accounting, 83% of the projects waiting are clean energy. “How do we create a faster process, not lower the bar on standards,” as Heinrich put it. The plant was the argument: Elastimold cable accessories and Fisher Pierce circuit solutions are the hardware that connects what the queue is holding up.</w:t>
+      </w:r>
+    </w:p>
+    <w:p>
+      <w:pPr>
+        <w:spacing w:after="0" w:line="240" w:lineRule="auto"/>
+      </w:pPr>
+    </w:p>
+    <w:p>
+      <w:pPr>
+        <w:spacing w:after="0" w:line="240" w:lineRule="auto"/>
+      </w:pPr>
+      <w:r>
+        <w:t xml:space="preserve">Two days later in Senatobia, Mississippi, ABB marked ten years at its circuit breaker factory and </w:t>
+      </w:r>
+      <w:hyperlink w:history="1" r:id="rIdroncf14uymcmahngjp1x7">
         <w:r>
           <w:rPr>
             <w:rStyle w:val="Hyperlink"/>
           </w:rPr>
-          <w:t xml:space="preserve">cut the ribbon on a new building that doubles the site’s footprint</w:t>
+          <w:t xml:space="preserve">cut the ribbon on a $40 million expansion that doubles the site’s footprint</w:t>
         </w:r>
       </w:hyperlink>
       <w:r>
-        <w:t xml:space="preserve">. Governor Tate Reeves, Congressman Trent Kelly, Mayor Greg Graves, and Swiss Consul General Rolf Ott all came. Kelly took a private tour and met with senior staff and with workers on the line. The $55 million project adds automated production lines, new technology and quality controls, employee training, and renovations to the existing plant, and ABB expects to hire roughly 200 more skilled employees over the coming year – on top of the 1,200 already working there. [SENATOBIA DATE TBD.]</w:t>
+        <w:t xml:space="preserve"> and adds about 200 jobs. Governor Tate Reeves, Congressman Trent Kelly, Mayor Greg Graves, and Swiss Consul General Rolf Ott all came on October 14. Kelly took a private tour and met with senior staff and with workers on the line. The project adds automated production lines, new technology and quality controls, employee training, and renovations to the existing plant – at a site that has been building circuit breakers in Mississippi, rather than importing them, since 2016.</w:t>
       </w:r>
     </w:p>
     <w:p>
@@ -143,25 +143,25 @@
         <w:t xml:space="preserve">Watts Brewing</w:t>
       </w:r>
       <w:r>
-        <w:t xml:space="preserve"> segment on site, over sweet tea. ABB also announced a donation to [COMMUNITY COLLEGE TBD – confirm recipient and amount]. Roughly $100 million has gone into the Senatobia site [TBD – your notes say over seven years; ABB’s own materials date the site to 2016 and the anniversary to ten years. Confirm which framing we want.]</w:t>
-      </w:r>
-    </w:p>
-    <w:p>
-      <w:pPr>
-        <w:spacing w:after="0" w:line="240" w:lineRule="auto"/>
-      </w:pPr>
-    </w:p>
-    <w:p>
-      <w:pPr>
-        <w:spacing w:after="0" w:line="240" w:lineRule="auto"/>
-        <w:jc w:val="center"/>
-      </w:pPr>
-      <w:r>
-        <w:rPr>
-          <w:i/>
-          <w:iCs/>
-        </w:rPr>
-        <w:t xml:space="preserve">[IMAGE TBD – Heinrich on the Albuquerque floor]</w:t>
+        <w:t xml:space="preserve"> segment on site, over sweet tea. ABB also donated $5,000 to the STEM program at Northwest Mississippi Community College, whose main campus sits in Senatobia.</w:t>
+      </w:r>
+    </w:p>
+    <w:p>
+      <w:pPr>
+        <w:spacing w:after="0" w:line="240" w:lineRule="auto"/>
+      </w:pPr>
+    </w:p>
+    <w:p>
+      <w:pPr>
+        <w:spacing w:after="0" w:line="240" w:lineRule="auto"/>
+        <w:jc w:val="center"/>
+      </w:pPr>
+      <w:r>
+        <w:rPr>
+          <w:i/>
+          <w:iCs/>
+        </w:rPr>
+        <w:t xml:space="preserve">[IMAGE TBD]</w:t>
       </w:r>
     </w:p>
     <w:p>
@@ -196,7 +196,7 @@
           <w:i/>
           <w:iCs/>
         </w:rPr>
-        <w:t xml:space="preserve">[IMAGE TBD – Senatobia ribbon cutting]</w:t>
+        <w:t xml:space="preserve">[IMAGE TBD]</w:t>
       </w:r>
     </w:p>
     <w:p>
@@ -252,51 +252,51 @@
         <w:spacing w:after="0" w:line="240" w:lineRule="auto"/>
       </w:pPr>
       <w:r>
-        <w:t xml:space="preserve">On September 15, ABB exhibited at the Congressional Grid Innovation Expo in the Rayburn House Office Building, hosted by NEMA, the GridWise Alliance, and the American Critical Minerals Association in conjunction with the House Grid Innovation Caucus. The premise of the morning was a number: electric load demand is projected to rise 55% by 2050. [TBD – what ABB showed on the floor, which Members and staff came through, and anything that came out of it.]</w:t>
-      </w:r>
-    </w:p>
-    <w:p>
-      <w:pPr>
-        <w:spacing w:after="0" w:line="240" w:lineRule="auto"/>
-      </w:pPr>
-    </w:p>
-    <w:p>
-      <w:pPr>
-        <w:spacing w:after="0" w:line="240" w:lineRule="auto"/>
-      </w:pPr>
-      <w:r>
-        <w:t xml:space="preserve">A week later, ABB took the same question to Climate Week NYC. [TBD – confirm which sessions ABB joined and who represented us; Cody [LAST NAME AND TITLE TBD] attended. Unconfirmed from research: pre-event listings place ABB on “New Frontiers in Data Center Efficiency,” a 12:15–13:00 panel at Sustainability LIVE at the Javits Center on September 22 with Alfa Laval, Digital Realty, and Compass Datacenters.] Brandon Spencer’s Bloomberg interview that week is below.</w:t>
-      </w:r>
-    </w:p>
-    <w:p>
-      <w:pPr>
-        <w:spacing w:after="0" w:line="240" w:lineRule="auto"/>
-      </w:pPr>
-    </w:p>
-    <w:p>
-      <w:pPr>
-        <w:spacing w:after="0" w:line="240" w:lineRule="auto"/>
-      </w:pPr>
-      <w:r>
-        <w:t xml:space="preserve">The thread from the Rayburn Foyer to the Javits Center is one argument: demand is rising across every sector at once, and the fastest capacity available is the efficiency already sitting in installed equipment. In his Climate Week opening keynote, International Energy Agency Executive Director Fatih Birol set out a “35 by 35” target – lifting electricity from just over 20% of final energy demand today to 35% by 2035. “35 by 35 will be the real target,” he said.</w:t>
-      </w:r>
-    </w:p>
-    <w:p>
-      <w:pPr>
-        <w:spacing w:after="0" w:line="240" w:lineRule="auto"/>
-      </w:pPr>
-    </w:p>
-    <w:p>
-      <w:pPr>
-        <w:spacing w:after="0" w:line="240" w:lineRule="auto"/>
-        <w:jc w:val="center"/>
-      </w:pPr>
-      <w:r>
-        <w:rPr>
-          <w:i/>
-          <w:iCs/>
-        </w:rPr>
-        <w:t xml:space="preserve">[IMAGE TBD – Climate Week, per Ryan’s note]</w:t>
+        <w:t xml:space="preserve">On September 15, ABB exhibited at the Congressional Grid Innovation Expo in the Rayburn House Office Building, hosted by NEMA, the GridWise Alliance, and the American Critical Minerals Association in conjunction with the House Grid Innovation Caucus. The premise of the morning was a number: electric load demand is projected to rise 55% by 2050, and the exhibits were there to show Members and staff what the technology answering it actually looks like.</w:t>
+      </w:r>
+    </w:p>
+    <w:p>
+      <w:pPr>
+        <w:spacing w:after="0" w:line="240" w:lineRule="auto"/>
+      </w:pPr>
+    </w:p>
+    <w:p>
+      <w:pPr>
+        <w:spacing w:after="0" w:line="240" w:lineRule="auto"/>
+      </w:pPr>
+      <w:r>
+        <w:t xml:space="preserve">A week later, ABB took the same question to Climate Week NYC. In his opening keynote, International Energy Agency Executive Director Fatih Birol set out a “35 by 35” target – lifting electricity from just over 20% of final energy demand today to 35% by 2035. “35 by 35 will be the real target,” he said. Demand is rising across every sector at once, and the fastest capacity available is the efficiency already sitting in installed equipment.</w:t>
+      </w:r>
+    </w:p>
+    <w:p>
+      <w:pPr>
+        <w:spacing w:after="0" w:line="240" w:lineRule="auto"/>
+      </w:pPr>
+    </w:p>
+    <w:p>
+      <w:pPr>
+        <w:spacing w:after="0" w:line="240" w:lineRule="auto"/>
+      </w:pPr>
+      <w:r>
+        <w:t xml:space="preserve">That is the argument ABB brought to both rooms, and it is the one Brandon Spencer took to Bloomberg from New York that week – below.</w:t>
+      </w:r>
+    </w:p>
+    <w:p>
+      <w:pPr>
+        <w:spacing w:after="0" w:line="240" w:lineRule="auto"/>
+      </w:pPr>
+    </w:p>
+    <w:p>
+      <w:pPr>
+        <w:spacing w:after="0" w:line="240" w:lineRule="auto"/>
+        <w:jc w:val="center"/>
+      </w:pPr>
+      <w:r>
+        <w:rPr>
+          <w:i/>
+          <w:iCs/>
+        </w:rPr>
+        <w:t xml:space="preserve">[IMAGE TBD]</w:t>
       </w:r>
     </w:p>
     <w:p>
@@ -338,7 +338,7 @@
         <w:spacing w:after="0" w:line="240" w:lineRule="auto"/>
       </w:pPr>
       <w:r>
-        <w:t xml:space="preserve">On September 16, ABB brought a NASCAR race car to the 25th annual Soirée Suisse at the Embassy of Switzerland in Washington, with NASCAR driver David Ragan on hand. [TBD – one line on how it landed and who came through.]</w:t>
+        <w:t xml:space="preserve">On September 16, ABB brought a NASCAR race car to the 25th annual Soirée Suisse at the Embassy of Switzerland in Washington, with NASCAR driver David Ragan on hand.</w:t>
       </w:r>
     </w:p>
     <w:p>
@@ -407,7 +407,7 @@
       <w:r>
         <w:t xml:space="preserve">September 2026 | Bloomberg: </w:t>
       </w:r>
-      <w:hyperlink w:history="1" r:id="rIdhstsefk_4siqsouxr0qqo">
+      <w:hyperlink w:history="1" r:id="rIdtdce28-teswgghmgfol-c">
         <w:r>
           <w:rPr>
             <w:rStyle w:val="Hyperlink"/>
@@ -484,19 +484,6 @@
       </w:r>
       <w:r>
         <w:t xml:space="preserve">: ABB Vice President of Strategic Partnerships Chris Shigas takes CBS’s weekly eco-innovation series inside the NASCAR EV prototype | CBS (November 7, 2026)</w:t>
-      </w:r>
-    </w:p>
-    <w:p>
-      <w:pPr>
-        <w:pStyle w:val="ListParagraph"/>
-        <w:numPr>
-          <w:ilvl w:val="0"/>
-          <w:numId w:val="2"/>
-        </w:numPr>
-        <w:spacing w:after="0" w:line="240" w:lineRule="auto"/>
-      </w:pPr>
-      <w:r>
-        <w:t xml:space="preserve">[ADDITIONAL EVENT TBD]: [Description] | [City, State] ([Date])</w:t>
       </w:r>
     </w:p>
     <w:p>

</xml_diff>

<commit_message>
docs: rewrite Q4 in the Q3 voice and add Cody Taylor
Q4 had drifted into date-led wire copy. Rewrites it on the Q3 pattern:
each section opens on the stakes rather than the calendar, quotes stand
as their own paragraph, and each section ends on a line that lands the
point.

Adds Cody Taylor, VP and Group Head of Government Relations and Public
Affairs, and what he argued at Climate Week: grid modernization plus
industrial efficiency, with the technology ready to scale now.

Attributes the 35% by 2035 electrification goal to COP31, following
ABB's own post, rather than to the IEA keynote.

Co-Authored-By: Claude Opus 5 <noreply@anthropic.com>
Claude-Session: https://claude.ai/code/session_011q5eW4NuKCCzyAiWXMj3FD
</commit_message>
<xml_diff>
--- a/newsletters/Q4_2026_ABB_Newsletter_Draft.docx
+++ b/newsletters/Q4_2026_ABB_Newsletter_Draft.docx
@@ -72,9 +72,22 @@
         <w:spacing w:after="0" w:line="240" w:lineRule="auto"/>
       </w:pPr>
       <w:r>
-        <w:t xml:space="preserve">On October 12, Senator Martin Heinrich came to ABB’s Elastimold plant in Albuquerque. The Ranking Member of the Senate Energy and Natural Resources Committee </w:t>
-      </w:r>
-      <w:hyperlink w:history="1" r:id="rIdcsrl2fuh4gst9gznsnpwp">
+        <w:t xml:space="preserve">The hardest problem on the American grid right now is not building the equipment. It is getting permission to connect it. By the sponsors’ own accounting, 83% of the projects waiting in the federal interconnection queue are clean energy – power that exists on paper and nowhere else.</w:t>
+      </w:r>
+    </w:p>
+    <w:p>
+      <w:pPr>
+        <w:spacing w:after="0" w:line="240" w:lineRule="auto"/>
+      </w:pPr>
+    </w:p>
+    <w:p>
+      <w:pPr>
+        <w:spacing w:after="0" w:line="240" w:lineRule="auto"/>
+      </w:pPr>
+      <w:r>
+        <w:t xml:space="preserve">That is the problem Senator Martin Heinrich came to Albuquerque to talk about on October 12. The Ranking Member of the Senate Energy and Natural Resources Committee </w:t>
+      </w:r>
+      <w:hyperlink w:history="1" r:id="rIdku-zripc1b3vpyuob3dda">
         <w:r>
           <w:rPr>
             <w:rStyle w:val="Hyperlink"/>
@@ -83,57 +96,70 @@
         </w:r>
       </w:hyperlink>
       <w:r>
-        <w:t xml:space="preserve"> and walked the floor – five stations where he could pick up the hardware and see how it gets built. “We need permitting reform to put more electrons on the grid,” Heinrich said. “It results in more jobs.”</w:t>
-      </w:r>
-    </w:p>
-    <w:p>
-      <w:pPr>
-        <w:spacing w:after="0" w:line="240" w:lineRule="auto"/>
-      </w:pPr>
-    </w:p>
-    <w:p>
-      <w:pPr>
-        <w:spacing w:after="0" w:line="240" w:lineRule="auto"/>
-      </w:pPr>
-      <w:r>
-        <w:t xml:space="preserve">He was there to make the case for the Bipartisan American Affordability and Jobs Act of 2026, which he introduced with Senators Lee, Capito, and Whitehouse. The bill speeds federal review of energy projects, requires data centers to pay for their own grid upgrades and their share of the existing grid, and targets an interconnection queue where, by the sponsors’ accounting, 83% of the projects waiting are clean energy. “How do we create a faster process, not lower the bar on standards,” as Heinrich put it. The plant was the argument: Elastimold cable accessories and Fisher Pierce circuit solutions are the hardware that connects what the queue is holding up.</w:t>
-      </w:r>
-    </w:p>
-    <w:p>
-      <w:pPr>
-        <w:spacing w:after="0" w:line="240" w:lineRule="auto"/>
-      </w:pPr>
-    </w:p>
-    <w:p>
-      <w:pPr>
-        <w:spacing w:after="0" w:line="240" w:lineRule="auto"/>
-      </w:pPr>
-      <w:r>
-        <w:t xml:space="preserve">Two days later in Senatobia, Mississippi, ABB marked ten years at its circuit breaker factory and </w:t>
-      </w:r>
-      <w:hyperlink w:history="1" r:id="rIdroncf14uymcmahngjp1x7">
+        <w:t xml:space="preserve"> at ABB’s Elastimold plant, then walked the floor – five stations where he could pick up the hardware and see how it gets made. He was making the case for the Bipartisan American Affordability and Jobs Act of 2026, which he introduced with Senators Lee, Capito, and Whitehouse. The bill speeds federal review of energy projects and requires data centers to pay for their own grid upgrades and their share of the grid they plug into.</w:t>
+      </w:r>
+    </w:p>
+    <w:p>
+      <w:pPr>
+        <w:spacing w:after="0" w:line="240" w:lineRule="auto"/>
+      </w:pPr>
+    </w:p>
+    <w:p>
+      <w:pPr>
+        <w:spacing w:after="0" w:line="240" w:lineRule="auto"/>
+      </w:pPr>
+      <w:r>
+        <w:t xml:space="preserve">“We need permitting reform to put more electrons on the grid,” Heinrich said. “It results in more jobs.” On the balance the bill is trying to strike: “How do we create a faster process, not lower the bar on standards.”</w:t>
+      </w:r>
+    </w:p>
+    <w:p>
+      <w:pPr>
+        <w:spacing w:after="0" w:line="240" w:lineRule="auto"/>
+      </w:pPr>
+    </w:p>
+    <w:p>
+      <w:pPr>
+        <w:spacing w:after="0" w:line="240" w:lineRule="auto"/>
+      </w:pPr>
+      <w:r>
+        <w:t xml:space="preserve">The plant was the argument. Elastimold cable accessories and Fisher Pierce circuit solutions are the hardware that connects what the queue is holding up, and they are made in Albuquerque.</w:t>
+      </w:r>
+    </w:p>
+    <w:p>
+      <w:pPr>
+        <w:spacing w:after="0" w:line="240" w:lineRule="auto"/>
+      </w:pPr>
+    </w:p>
+    <w:p>
+      <w:pPr>
+        <w:spacing w:after="0" w:line="240" w:lineRule="auto"/>
+      </w:pPr>
+      <w:r>
+        <w:t xml:space="preserve">Two days later, ABB made the same case in Mississippi with a ribbon. On October 14, the company marked ten years at its Senatobia circuit breaker factory and </w:t>
+      </w:r>
+      <w:hyperlink w:history="1" r:id="rId193vrkq959krzrasvwn6s">
         <w:r>
           <w:rPr>
             <w:rStyle w:val="Hyperlink"/>
           </w:rPr>
-          <w:t xml:space="preserve">cut the ribbon on a $40 million expansion that doubles the site’s footprint</w:t>
+          <w:t xml:space="preserve">opened a $40 million expansion</w:t>
         </w:r>
       </w:hyperlink>
       <w:r>
-        <w:t xml:space="preserve"> and adds about 200 jobs. Governor Tate Reeves, Congressman Trent Kelly, Mayor Greg Graves, and Swiss Consul General Rolf Ott all came on October 14. Kelly took a private tour and met with senior staff and with workers on the line. The project adds automated production lines, new technology and quality controls, employee training, and renovations to the existing plant – at a site that has been building circuit breakers in Mississippi, rather than importing them, since 2016.</w:t>
-      </w:r>
-    </w:p>
-    <w:p>
-      <w:pPr>
-        <w:spacing w:after="0" w:line="240" w:lineRule="auto"/>
-      </w:pPr>
-    </w:p>
-    <w:p>
-      <w:pPr>
-        <w:spacing w:after="0" w:line="240" w:lineRule="auto"/>
-      </w:pPr>
-      <w:r>
-        <w:t xml:space="preserve">The day before, ABB hosted more than 60 U.S. customers in Oxford, who came through the plant to see the new SACE Emax 3 air circuit breaker. NEMA President and CEO Debra Phillips and Consul General Ott filmed a </w:t>
+        <w:t xml:space="preserve"> that doubles the site’s footprint and adds about 200 jobs. Governor Tate Reeves, Congressman Trent Kelly, Mayor Greg Graves, and Swiss Consul General Rolf Ott all came. Kelly took a private tour and met with senior staff and with workers on the line. The expansion brings automated production lines, new technology and quality controls, employee training, and renovations to the existing plant.</w:t>
+      </w:r>
+    </w:p>
+    <w:p>
+      <w:pPr>
+        <w:spacing w:after="0" w:line="240" w:lineRule="auto"/>
+      </w:pPr>
+    </w:p>
+    <w:p>
+      <w:pPr>
+        <w:spacing w:after="0" w:line="240" w:lineRule="auto"/>
+      </w:pPr>
+      <w:r>
+        <w:t xml:space="preserve">The day before, more than 60 U.S. customers gathered in Oxford and came through the plant to see the new SACE Emax 3 air circuit breaker. NEMA President and CEO Debra Phillips and Consul General Ott filmed a </w:t>
       </w:r>
       <w:r>
         <w:rPr>
@@ -143,7 +169,20 @@
         <w:t xml:space="preserve">Watts Brewing</w:t>
       </w:r>
       <w:r>
-        <w:t xml:space="preserve"> segment on site, over sweet tea. ABB also donated $5,000 to the STEM program at Northwest Mississippi Community College, whose main campus sits in Senatobia.</w:t>
+        <w:t xml:space="preserve"> segment on site, over sweet tea. ABB also donated $5,000 to the STEM program at Northwest Mississippi Community College, whose main campus is in Senatobia.</w:t>
+      </w:r>
+    </w:p>
+    <w:p>
+      <w:pPr>
+        <w:spacing w:after="0" w:line="240" w:lineRule="auto"/>
+      </w:pPr>
+    </w:p>
+    <w:p>
+      <w:pPr>
+        <w:spacing w:after="0" w:line="240" w:lineRule="auto"/>
+      </w:pPr>
+      <w:r>
+        <w:t xml:space="preserve">Senatobia has been building circuit breakers in Mississippi, rather than importing them, since 2016. Ten years on, the case for building here is no longer a projection. It is a payroll.</w:t>
       </w:r>
     </w:p>
     <w:p>
@@ -252,33 +291,46 @@
         <w:spacing w:after="0" w:line="240" w:lineRule="auto"/>
       </w:pPr>
       <w:r>
-        <w:t xml:space="preserve">On September 15, ABB exhibited at the Congressional Grid Innovation Expo in the Rayburn House Office Building, hosted by NEMA, the GridWise Alliance, and the American Critical Minerals Association in conjunction with the House Grid Innovation Caucus. The premise of the morning was a number: electric load demand is projected to rise 55% by 2050, and the exhibits were there to show Members and staff what the technology answering it actually looks like.</w:t>
-      </w:r>
-    </w:p>
-    <w:p>
-      <w:pPr>
-        <w:spacing w:after="0" w:line="240" w:lineRule="auto"/>
-      </w:pPr>
-    </w:p>
-    <w:p>
-      <w:pPr>
-        <w:spacing w:after="0" w:line="240" w:lineRule="auto"/>
-      </w:pPr>
-      <w:r>
-        <w:t xml:space="preserve">A week later, ABB took the same question to Climate Week NYC. In his opening keynote, International Energy Agency Executive Director Fatih Birol set out a “35 by 35” target – lifting electricity from just over 20% of final energy demand today to 35% by 2035. “35 by 35 will be the real target,” he said. Demand is rising across every sector at once, and the fastest capacity available is the efficiency already sitting in installed equipment.</w:t>
-      </w:r>
-    </w:p>
-    <w:p>
-      <w:pPr>
-        <w:spacing w:after="0" w:line="240" w:lineRule="auto"/>
-      </w:pPr>
-    </w:p>
-    <w:p>
-      <w:pPr>
-        <w:spacing w:after="0" w:line="240" w:lineRule="auto"/>
-      </w:pPr>
-      <w:r>
-        <w:t xml:space="preserve">That is the argument ABB brought to both rooms, and it is the one Brandon Spencer took to Bloomberg from New York that week – below.</w:t>
+        <w:t xml:space="preserve">Every forecast for American electricity now points the same way, and the argument has stopped being about whether demand rises. Electric load is projected to climb 55% by 2050. The open question is what gets built, and how fast it can be connected.</w:t>
+      </w:r>
+    </w:p>
+    <w:p>
+      <w:pPr>
+        <w:spacing w:after="0" w:line="240" w:lineRule="auto"/>
+      </w:pPr>
+    </w:p>
+    <w:p>
+      <w:pPr>
+        <w:spacing w:after="0" w:line="240" w:lineRule="auto"/>
+      </w:pPr>
+      <w:r>
+        <w:t xml:space="preserve">On September 15, ABB exhibited at the Congressional Grid Innovation Expo in the Rayburn House Office Building, hosted by NEMA, the GridWise Alliance, and the American Critical Minerals Association in conjunction with the House Grid Innovation Caucus. It is a morning built to put the technology answering that number in front of the Members and staff who will write the rules around it.</w:t>
+      </w:r>
+    </w:p>
+    <w:p>
+      <w:pPr>
+        <w:spacing w:after="0" w:line="240" w:lineRule="auto"/>
+      </w:pPr>
+    </w:p>
+    <w:p>
+      <w:pPr>
+        <w:spacing w:after="0" w:line="240" w:lineRule="auto"/>
+      </w:pPr>
+      <w:r>
+        <w:t xml:space="preserve">A week later ABB carried the same question to Climate Week NYC, where Cody Taylor, ABB’s Vice President and Group Head of Government Relations and Public Affairs, told New York policymakers that a far larger share of the economy needs to be electrified – and named the two things that get it there. Modernize the grid: flexibility, digital capability, resilience. Then take demand out of industry, so the capacity freed up can go to growth somewhere else. ABB builds for both ends of that, from microgrids, digital substations, and energy storage to high-efficiency motors and drives.</w:t>
+      </w:r>
+    </w:p>
+    <w:p>
+      <w:pPr>
+        <w:spacing w:after="0" w:line="240" w:lineRule="auto"/>
+      </w:pPr>
+    </w:p>
+    <w:p>
+      <w:pPr>
+        <w:spacing w:after="0" w:line="240" w:lineRule="auto"/>
+      </w:pPr>
+      <w:r>
+        <w:t xml:space="preserve">His point to the room was that none of this is waiting on invention. The technology is ready to scale now, which is why ABB supports the COP31 goal of electrifying 35% of the economy by 2035. Brandon Spencer made the same argument on television that week, below.</w:t>
       </w:r>
     </w:p>
     <w:p>
@@ -338,7 +390,7 @@
         <w:spacing w:after="0" w:line="240" w:lineRule="auto"/>
       </w:pPr>
       <w:r>
-        <w:t xml:space="preserve">On September 16, ABB brought a NASCAR race car to the 25th annual Soirée Suisse at the Embassy of Switzerland in Washington, with NASCAR driver David Ragan on hand.</w:t>
+        <w:t xml:space="preserve">On September 16, ABB brought a NASCAR race car to the 25th annual Soirée Suisse at the Embassy of Switzerland in Washington, with driver David Ragan on hand. A race car is an unusual way to make an argument about electrification, which is precisely why it works in a room full of people who have heard that argument made every other way.</w:t>
       </w:r>
     </w:p>
     <w:p>
@@ -407,7 +459,7 @@
       <w:r>
         <w:t xml:space="preserve">September 2026 | Bloomberg: </w:t>
       </w:r>
-      <w:hyperlink w:history="1" r:id="rIdtdce28-teswgghmgfol-c">
+      <w:hyperlink w:history="1" r:id="rIdzjn-gsbluhexcmvagfccg">
         <w:r>
           <w:rPr>
             <w:rStyle w:val="Hyperlink"/>

</xml_diff>

<commit_message>
docs: rebuild Q4 to match the shipped Q3 house style
The shipped Q3 is leaner than the draft I had been matching. Rebuilds
Q4 to its actual patterns:

- Short paragraphs; trimmed qualifying clauses.
- In features, the thematic line sits second, after the setup, and the
  section closes on fact rather than a flourish.
- Captions are short descriptive lines under the art, not bracketed
  placeholders.
- Looking Ahead switches to the date-first format Q3 shipped with.
- Soiree Suisse named as the ABB NASCAR EV Prototype, per Q3's own
  Looking Ahead entry, and promoted to a feature with the NASCAR IMPACT
  context Q3 used.

Also commits the shipped Q3 for future reference.

Co-Authored-By: Claude Opus 5 <noreply@anthropic.com>
Claude-Session: https://claude.ai/code/session_011q5eW4NuKCCzyAiWXMj3FD
</commit_message>
<xml_diff>
--- a/newsletters/Q4_2026_ABB_Newsletter_Draft.docx
+++ b/newsletters/Q4_2026_ABB_Newsletter_Draft.docx
@@ -45,7 +45,7 @@
         <w:spacing w:after="0" w:line="240" w:lineRule="auto"/>
       </w:pPr>
       <w:r>
-        <w:t xml:space="preserve">ABB in Action: Sen. Heinrich on the Factory Floor, Ten Years in Senatobia, and Powering What Comes Next</w:t>
+        <w:t xml:space="preserve">ABB in Action: Senator Heinrich on the Factory Floor, Ten Years in Senatobia, Powering Growth Across the Economy, and More</w:t>
       </w:r>
     </w:p>
     <w:p>
@@ -72,22 +72,22 @@
         <w:spacing w:after="0" w:line="240" w:lineRule="auto"/>
       </w:pPr>
       <w:r>
-        <w:t xml:space="preserve">The hardest problem on the American grid right now is not building the equipment. It is getting permission to connect it. By the sponsors’ own accounting, 83% of the projects waiting in the federal interconnection queue are clean energy – power that exists on paper and nowhere else.</w:t>
-      </w:r>
-    </w:p>
-    <w:p>
-      <w:pPr>
-        <w:spacing w:after="0" w:line="240" w:lineRule="auto"/>
-      </w:pPr>
-    </w:p>
-    <w:p>
-      <w:pPr>
-        <w:spacing w:after="0" w:line="240" w:lineRule="auto"/>
-      </w:pPr>
-      <w:r>
-        <w:t xml:space="preserve">That is the problem Senator Martin Heinrich came to Albuquerque to talk about on October 12. The Ranking Member of the Senate Energy and Natural Resources Committee </w:t>
-      </w:r>
-      <w:hyperlink w:history="1" r:id="rIdku-zripc1b3vpyuob3dda">
+        <w:t xml:space="preserve">The hardest problem on the American grid is not building the equipment. It is getting permission to connect it. By the sponsors’ accounting, 83% of the projects waiting in the federal interconnection queue are clean energy.</w:t>
+      </w:r>
+    </w:p>
+    <w:p>
+      <w:pPr>
+        <w:spacing w:after="0" w:line="240" w:lineRule="auto"/>
+      </w:pPr>
+    </w:p>
+    <w:p>
+      <w:pPr>
+        <w:spacing w:after="0" w:line="240" w:lineRule="auto"/>
+      </w:pPr>
+      <w:r>
+        <w:t xml:space="preserve">On October 12, Senator Martin Heinrich came to ABB’s Elastimold plant in Albuquerque. The Ranking Member of the Senate Energy and Natural Resources Committee </w:t>
+      </w:r>
+      <w:hyperlink w:history="1" r:id="rIdjmdkrc5qztuhhyyflgg97">
         <w:r>
           <w:rPr>
             <w:rStyle w:val="Hyperlink"/>
@@ -96,48 +96,35 @@
         </w:r>
       </w:hyperlink>
       <w:r>
-        <w:t xml:space="preserve"> at ABB’s Elastimold plant, then walked the floor – five stations where he could pick up the hardware and see how it gets made. He was making the case for the Bipartisan American Affordability and Jobs Act of 2026, which he introduced with Senators Lee, Capito, and Whitehouse. The bill speeds federal review of energy projects and requires data centers to pay for their own grid upgrades and their share of the grid they plug into.</w:t>
-      </w:r>
-    </w:p>
-    <w:p>
-      <w:pPr>
-        <w:spacing w:after="0" w:line="240" w:lineRule="auto"/>
-      </w:pPr>
-    </w:p>
-    <w:p>
-      <w:pPr>
-        <w:spacing w:after="0" w:line="240" w:lineRule="auto"/>
-      </w:pPr>
-      <w:r>
-        <w:t xml:space="preserve">“We need permitting reform to put more electrons on the grid,” Heinrich said. “It results in more jobs.” On the balance the bill is trying to strike: “How do we create a faster process, not lower the bar on standards.”</w:t>
-      </w:r>
-    </w:p>
-    <w:p>
-      <w:pPr>
-        <w:spacing w:after="0" w:line="240" w:lineRule="auto"/>
-      </w:pPr>
-    </w:p>
-    <w:p>
-      <w:pPr>
-        <w:spacing w:after="0" w:line="240" w:lineRule="auto"/>
-      </w:pPr>
-      <w:r>
-        <w:t xml:space="preserve">The plant was the argument. Elastimold cable accessories and Fisher Pierce circuit solutions are the hardware that connects what the queue is holding up, and they are made in Albuquerque.</w:t>
-      </w:r>
-    </w:p>
-    <w:p>
-      <w:pPr>
-        <w:spacing w:after="0" w:line="240" w:lineRule="auto"/>
-      </w:pPr>
-    </w:p>
-    <w:p>
-      <w:pPr>
-        <w:spacing w:after="0" w:line="240" w:lineRule="auto"/>
-      </w:pPr>
-      <w:r>
-        <w:t xml:space="preserve">Two days later, ABB made the same case in Mississippi with a ribbon. On October 14, the company marked ten years at its Senatobia circuit breaker factory and </w:t>
-      </w:r>
-      <w:hyperlink w:history="1" r:id="rId193vrkq959krzrasvwn6s">
+        <w:t xml:space="preserve">, then walked the floor through five stations of ABB products. He was making the case for the Bipartisan American Affordability and Jobs Act of 2026, which he introduced with Senators Lee, Capito, and Whitehouse. The bill speeds federal review of energy projects and requires data centers to pay for their own grid upgrades.</w:t>
+      </w:r>
+    </w:p>
+    <w:p>
+      <w:pPr>
+        <w:spacing w:after="0" w:line="240" w:lineRule="auto"/>
+      </w:pPr>
+    </w:p>
+    <w:p>
+      <w:pPr>
+        <w:spacing w:after="0" w:line="240" w:lineRule="auto"/>
+      </w:pPr>
+      <w:r>
+        <w:t xml:space="preserve">“We need permitting reform to put more electrons on the grid,” Heinrich said. “It results in more jobs.”</w:t>
+      </w:r>
+    </w:p>
+    <w:p>
+      <w:pPr>
+        <w:spacing w:after="0" w:line="240" w:lineRule="auto"/>
+      </w:pPr>
+    </w:p>
+    <w:p>
+      <w:pPr>
+        <w:spacing w:after="0" w:line="240" w:lineRule="auto"/>
+      </w:pPr>
+      <w:r>
+        <w:t xml:space="preserve">Two days later in Senatobia, Mississippi, ABB marked ten years at its circuit breaker factory and </w:t>
+      </w:r>
+      <w:hyperlink w:history="1" r:id="rIdkglgk4tmle5ruwc8pqb_q">
         <w:r>
           <w:rPr>
             <w:rStyle w:val="Hyperlink"/>
@@ -146,7 +133,7 @@
         </w:r>
       </w:hyperlink>
       <w:r>
-        <w:t xml:space="preserve"> that doubles the site’s footprint and adds about 200 jobs. Governor Tate Reeves, Congressman Trent Kelly, Mayor Greg Graves, and Swiss Consul General Rolf Ott all came. Kelly took a private tour and met with senior staff and with workers on the line. The expansion brings automated production lines, new technology and quality controls, employee training, and renovations to the existing plant.</w:t>
+        <w:t xml:space="preserve"> that doubles the site’s footprint and adds about 200 jobs. Governor Tate Reeves, Congressman Trent Kelly, Mayor Greg Graves, and Swiss Consul General Rolf Ott attended. Kelly toured the plant privately and met with senior staff and workers on the line.</w:t>
       </w:r>
     </w:p>
     <w:p>
@@ -169,20 +156,20 @@
         <w:t xml:space="preserve">Watts Brewing</w:t>
       </w:r>
       <w:r>
-        <w:t xml:space="preserve"> segment on site, over sweet tea. ABB also donated $5,000 to the STEM program at Northwest Mississippi Community College, whose main campus is in Senatobia.</w:t>
-      </w:r>
-    </w:p>
-    <w:p>
-      <w:pPr>
-        <w:spacing w:after="0" w:line="240" w:lineRule="auto"/>
-      </w:pPr>
-    </w:p>
-    <w:p>
-      <w:pPr>
-        <w:spacing w:after="0" w:line="240" w:lineRule="auto"/>
-      </w:pPr>
-      <w:r>
-        <w:t xml:space="preserve">Senatobia has been building circuit breakers in Mississippi, rather than importing them, since 2016. Ten years on, the case for building here is no longer a projection. It is a payroll.</w:t>
+        <w:t xml:space="preserve"> segment on site. ABB donated $5,000 to the STEM program at Northwest Mississippi Community College.</w:t>
+      </w:r>
+    </w:p>
+    <w:p>
+      <w:pPr>
+        <w:spacing w:after="0" w:line="240" w:lineRule="auto"/>
+      </w:pPr>
+    </w:p>
+    <w:p>
+      <w:pPr>
+        <w:spacing w:after="0" w:line="240" w:lineRule="auto"/>
+      </w:pPr>
+      <w:r>
+        <w:t xml:space="preserve">Senatobia has built circuit breakers in Mississippi, rather than importing them, since 2016. The case for building here is no longer a projection.</w:t>
       </w:r>
     </w:p>
     <w:p>
@@ -206,7 +193,45 @@
     <w:p>
       <w:pPr>
         <w:spacing w:after="0" w:line="240" w:lineRule="auto"/>
+      </w:pPr>
+      <w:r>
+        <w:t xml:space="preserve">Senator Heinrich tours ABB’s Elastimold plant in Albuquerque</w:t>
+      </w:r>
+    </w:p>
+    <w:p>
+      <w:pPr>
+        <w:spacing w:after="0" w:line="240" w:lineRule="auto"/>
+      </w:pPr>
+    </w:p>
+    <w:p>
+      <w:pPr>
+        <w:spacing w:after="0" w:line="240" w:lineRule="auto"/>
         <w:jc w:val="center"/>
+      </w:pPr>
+      <w:r>
+        <w:rPr>
+          <w:i/>
+          <w:iCs/>
+        </w:rPr>
+        <w:t xml:space="preserve">[IMAGE TBD]</w:t>
+      </w:r>
+    </w:p>
+    <w:p>
+      <w:pPr>
+        <w:spacing w:after="0" w:line="240" w:lineRule="auto"/>
+      </w:pPr>
+      <w:r>
+        <w:t xml:space="preserve">Governor Reeves, Congressman Kelly, and ABB leaders at the Senatobia ribbon cutting</w:t>
+      </w:r>
+    </w:p>
+    <w:p>
+      <w:pPr>
+        <w:spacing w:after="0" w:line="240" w:lineRule="auto"/>
+      </w:pPr>
+    </w:p>
+    <w:p>
+      <w:pPr>
+        <w:spacing w:after="0" w:line="240" w:lineRule="auto"/>
       </w:pPr>
       <w:r>
         <w:rPr>
@@ -214,45 +239,93 @@
           <w:bCs/>
           <w:i/>
           <w:iCs/>
-          <w:sz w:val="20"/>
-          <w:szCs w:val="20"/>
-        </w:rPr>
-        <w:t xml:space="preserve">[Caption TBD]</w:t>
-      </w:r>
-    </w:p>
-    <w:p>
-      <w:pPr>
-        <w:spacing w:after="0" w:line="240" w:lineRule="auto"/>
-      </w:pPr>
-    </w:p>
-    <w:p>
-      <w:pPr>
-        <w:spacing w:after="0" w:line="240" w:lineRule="auto"/>
-        <w:jc w:val="center"/>
-      </w:pPr>
-      <w:r>
-        <w:rPr>
-          <w:i/>
-          <w:iCs/>
-        </w:rPr>
-        <w:t xml:space="preserve">[IMAGE TBD]</w:t>
-      </w:r>
-    </w:p>
-    <w:p>
-      <w:pPr>
-        <w:spacing w:after="0" w:line="240" w:lineRule="auto"/>
-        <w:jc w:val="center"/>
+        </w:rPr>
+        <w:t xml:space="preserve">[Features]</w:t>
+      </w:r>
+    </w:p>
+    <w:p>
+      <w:pPr>
+        <w:spacing w:after="0" w:line="240" w:lineRule="auto"/>
       </w:pPr>
       <w:r>
         <w:rPr>
           <w:b/>
           <w:bCs/>
-          <w:i/>
-          <w:iCs/>
-          <w:sz w:val="20"/>
-          <w:szCs w:val="20"/>
-        </w:rPr>
-        <w:t xml:space="preserve">[Caption TBD]</w:t>
+        </w:rPr>
+        <w:t xml:space="preserve">Powering Growth Across Every Sector of the Economy</w:t>
+      </w:r>
+    </w:p>
+    <w:p>
+      <w:pPr>
+        <w:spacing w:after="0" w:line="240" w:lineRule="auto"/>
+      </w:pPr>
+      <w:r>
+        <w:t xml:space="preserve">Electric load demand is projected to rise 55% by 2050. On September 15, ABB exhibited at the Congressional Grid Innovation Expo in the Rayburn House Office Building, hosted by NEMA, the GridWise Alliance, and the American Critical Minerals Association in conjunction with the House Grid Innovation Caucus.</w:t>
+      </w:r>
+    </w:p>
+    <w:p>
+      <w:pPr>
+        <w:spacing w:after="0" w:line="240" w:lineRule="auto"/>
+      </w:pPr>
+    </w:p>
+    <w:p>
+      <w:pPr>
+        <w:spacing w:after="0" w:line="240" w:lineRule="auto"/>
+      </w:pPr>
+      <w:r>
+        <w:t xml:space="preserve">Meeting that demand is less a question of invention than of deployment. The technology is ready to scale now – the work is modernizing the grid and freeing up the capacity already sitting in installed equipment.</w:t>
+      </w:r>
+    </w:p>
+    <w:p>
+      <w:pPr>
+        <w:spacing w:after="0" w:line="240" w:lineRule="auto"/>
+      </w:pPr>
+    </w:p>
+    <w:p>
+      <w:pPr>
+        <w:spacing w:after="0" w:line="240" w:lineRule="auto"/>
+      </w:pPr>
+      <w:r>
+        <w:t xml:space="preserve">A week later at Climate Week NYC, Cody Taylor, ABB’s Vice President and Group Head of Government Relations and Public Affairs, told New York policymakers that a far larger share of the economy needs to be electrified, and named two priorities for getting there: grid modernization – flexibility, digital capability, and resilience – and industrial energy efficiency, which cuts demand to free capacity for growth elsewhere. ABB’s portfolio covers both, from microgrids, digital substations, and energy storage to high-efficiency motors and drives.</w:t>
+      </w:r>
+    </w:p>
+    <w:p>
+      <w:pPr>
+        <w:spacing w:after="0" w:line="240" w:lineRule="auto"/>
+      </w:pPr>
+    </w:p>
+    <w:p>
+      <w:pPr>
+        <w:spacing w:after="0" w:line="240" w:lineRule="auto"/>
+      </w:pPr>
+      <w:r>
+        <w:t xml:space="preserve">ABB supports the COP31 goal of electrifying 35% of the economy by 2035.</w:t>
+      </w:r>
+    </w:p>
+    <w:p>
+      <w:pPr>
+        <w:spacing w:after="0" w:line="240" w:lineRule="auto"/>
+      </w:pPr>
+    </w:p>
+    <w:p>
+      <w:pPr>
+        <w:spacing w:after="0" w:line="240" w:lineRule="auto"/>
+        <w:jc w:val="center"/>
+      </w:pPr>
+      <w:r>
+        <w:rPr>
+          <w:i/>
+          <w:iCs/>
+        </w:rPr>
+        <w:t xml:space="preserve">[IMAGE TBD]</w:t>
+      </w:r>
+    </w:p>
+    <w:p>
+      <w:pPr>
+        <w:spacing w:after="0" w:line="240" w:lineRule="auto"/>
+      </w:pPr>
+      <w:r>
+        <w:t xml:space="preserve">Cody Taylor at Climate Week NYC</w:t>
       </w:r>
     </w:p>
     <w:p>
@@ -268,69 +341,29 @@
         <w:rPr>
           <w:b/>
           <w:bCs/>
-          <w:i/>
-          <w:iCs/>
-        </w:rPr>
-        <w:t xml:space="preserve">[Features]</w:t>
-      </w:r>
-    </w:p>
-    <w:p>
-      <w:pPr>
-        <w:spacing w:after="0" w:line="240" w:lineRule="auto"/>
-      </w:pPr>
-      <w:r>
-        <w:rPr>
-          <w:b/>
-          <w:bCs/>
-        </w:rPr>
-        <w:t xml:space="preserve">Powering Growth: Where the Demand Is Coming From</w:t>
-      </w:r>
-    </w:p>
-    <w:p>
-      <w:pPr>
-        <w:spacing w:after="0" w:line="240" w:lineRule="auto"/>
-      </w:pPr>
-      <w:r>
-        <w:t xml:space="preserve">Every forecast for American electricity now points the same way, and the argument has stopped being about whether demand rises. Electric load is projected to climb 55% by 2050. The open question is what gets built, and how fast it can be connected.</w:t>
-      </w:r>
-    </w:p>
-    <w:p>
-      <w:pPr>
-        <w:spacing w:after="0" w:line="240" w:lineRule="auto"/>
-      </w:pPr>
-    </w:p>
-    <w:p>
-      <w:pPr>
-        <w:spacing w:after="0" w:line="240" w:lineRule="auto"/>
-      </w:pPr>
-      <w:r>
-        <w:t xml:space="preserve">On September 15, ABB exhibited at the Congressional Grid Innovation Expo in the Rayburn House Office Building, hosted by NEMA, the GridWise Alliance, and the American Critical Minerals Association in conjunction with the House Grid Innovation Caucus. It is a morning built to put the technology answering that number in front of the Members and staff who will write the rules around it.</w:t>
-      </w:r>
-    </w:p>
-    <w:p>
-      <w:pPr>
-        <w:spacing w:after="0" w:line="240" w:lineRule="auto"/>
-      </w:pPr>
-    </w:p>
-    <w:p>
-      <w:pPr>
-        <w:spacing w:after="0" w:line="240" w:lineRule="auto"/>
-      </w:pPr>
-      <w:r>
-        <w:t xml:space="preserve">A week later ABB carried the same question to Climate Week NYC, where Cody Taylor, ABB’s Vice President and Group Head of Government Relations and Public Affairs, told New York policymakers that a far larger share of the economy needs to be electrified – and named the two things that get it there. Modernize the grid: flexibility, digital capability, resilience. Then take demand out of industry, so the capacity freed up can go to growth somewhere else. ABB builds for both ends of that, from microgrids, digital substations, and energy storage to high-efficiency motors and drives.</w:t>
-      </w:r>
-    </w:p>
-    <w:p>
-      <w:pPr>
-        <w:spacing w:after="0" w:line="240" w:lineRule="auto"/>
-      </w:pPr>
-    </w:p>
-    <w:p>
-      <w:pPr>
-        <w:spacing w:after="0" w:line="240" w:lineRule="auto"/>
-      </w:pPr>
-      <w:r>
-        <w:t xml:space="preserve">His point to the room was that none of this is waiting on invention. The technology is ready to scale now, which is why ABB supports the COP31 goal of electrifying 35% of the economy by 2035. Brandon Spencer made the same argument on television that week, below.</w:t>
+        </w:rPr>
+        <w:t xml:space="preserve">The ABB NASCAR EV Prototype Comes to the Swiss Embassy</w:t>
+      </w:r>
+    </w:p>
+    <w:p>
+      <w:pPr>
+        <w:spacing w:after="0" w:line="240" w:lineRule="auto"/>
+      </w:pPr>
+      <w:r>
+        <w:t xml:space="preserve">On September 16, ABB featured the ABB NASCAR EV Prototype at the 25th annual Soirée Suisse, the Embassy of Switzerland reception convening government, business, and diplomatic leaders in Washington, DC. NASCAR driver David Ragan joined ABB on site.</w:t>
+      </w:r>
+    </w:p>
+    <w:p>
+      <w:pPr>
+        <w:spacing w:after="0" w:line="240" w:lineRule="auto"/>
+      </w:pPr>
+    </w:p>
+    <w:p>
+      <w:pPr>
+        <w:spacing w:after="0" w:line="240" w:lineRule="auto"/>
+      </w:pPr>
+      <w:r>
+        <w:t xml:space="preserve">ABB is a founding member of NASCAR IMPACT and NASCAR’s official electrification partner. The prototype has spent the year doing the same job in different rooms – making American electrification something people can walk up to and put a hand on.</w:t>
       </w:r>
     </w:p>
     <w:p>
@@ -354,78 +387,9 @@
     <w:p>
       <w:pPr>
         <w:spacing w:after="0" w:line="240" w:lineRule="auto"/>
-        <w:jc w:val="center"/>
-      </w:pPr>
-      <w:r>
-        <w:rPr>
-          <w:b/>
-          <w:bCs/>
-          <w:i/>
-          <w:iCs/>
-          <w:sz w:val="20"/>
-          <w:szCs w:val="20"/>
-        </w:rPr>
-        <w:t xml:space="preserve">[Caption TBD]</w:t>
-      </w:r>
-    </w:p>
-    <w:p>
-      <w:pPr>
-        <w:spacing w:after="0" w:line="240" w:lineRule="auto"/>
-      </w:pPr>
-    </w:p>
-    <w:p>
-      <w:pPr>
-        <w:spacing w:after="0" w:line="240" w:lineRule="auto"/>
-      </w:pPr>
-      <w:r>
-        <w:rPr>
-          <w:b/>
-          <w:bCs/>
-        </w:rPr>
-        <w:t xml:space="preserve">A Race Car at the Swiss Embassy</w:t>
-      </w:r>
-    </w:p>
-    <w:p>
-      <w:pPr>
-        <w:spacing w:after="0" w:line="240" w:lineRule="auto"/>
-      </w:pPr>
-      <w:r>
-        <w:t xml:space="preserve">On September 16, ABB brought a NASCAR race car to the 25th annual Soirée Suisse at the Embassy of Switzerland in Washington, with driver David Ragan on hand. A race car is an unusual way to make an argument about electrification, which is precisely why it works in a room full of people who have heard that argument made every other way.</w:t>
-      </w:r>
-    </w:p>
-    <w:p>
-      <w:pPr>
-        <w:spacing w:after="0" w:line="240" w:lineRule="auto"/>
-      </w:pPr>
-    </w:p>
-    <w:p>
-      <w:pPr>
-        <w:spacing w:after="0" w:line="240" w:lineRule="auto"/>
-        <w:jc w:val="center"/>
-      </w:pPr>
-      <w:r>
-        <w:rPr>
-          <w:i/>
-          <w:iCs/>
-        </w:rPr>
-        <w:t xml:space="preserve">[IMAGE TBD]</w:t>
-      </w:r>
-    </w:p>
-    <w:p>
-      <w:pPr>
-        <w:spacing w:after="0" w:line="240" w:lineRule="auto"/>
-        <w:jc w:val="center"/>
-      </w:pPr>
-      <w:r>
-        <w:rPr>
-          <w:b/>
-          <w:bCs/>
-          <w:i/>
-          <w:iCs/>
-          <w:sz w:val="20"/>
-          <w:szCs w:val="20"/>
-        </w:rPr>
-        <w:t xml:space="preserve">[Caption TBD]</w:t>
+      </w:pPr>
+      <w:r>
+        <w:t xml:space="preserve">The ABB NASCAR EV Prototype at the Embassy of Switzerland</w:t>
       </w:r>
     </w:p>
     <w:p>
@@ -459,7 +423,7 @@
       <w:r>
         <w:t xml:space="preserve">September 2026 | Bloomberg: </w:t>
       </w:r>
-      <w:hyperlink w:history="1" r:id="rIdzjn-gsbluhexcmvagfccg">
+      <w:hyperlink w:history="1" r:id="rIdimgtp_jdzdddmcquqs6-f">
         <w:r>
           <w:rPr>
             <w:rStyle w:val="Hyperlink"/>
@@ -478,17 +442,7 @@
         <w:spacing w:after="0" w:line="240" w:lineRule="auto"/>
       </w:pPr>
       <w:r>
-        <w:t xml:space="preserve">Brandon Spencer, President of ABB’s Motion Business Area, joins Romaine Bostick and Bailey Lipschultz on </w:t>
-      </w:r>
-      <w:r>
-        <w:rPr>
-          <w:i/>
-          <w:iCs/>
-        </w:rPr>
-        <w:t xml:space="preserve">Bloomberg Markets: The Close</w:t>
-      </w:r>
-      <w:r>
-        <w:t xml:space="preserve"> to discuss Infinitus, ABB’s new direct-current portfolio for AI data centers. Spencer describes rack-level power demand climbing toward roughly one megawatt per rack – five to six times today’s levels – and where DC distribution fits in meeting it.</w:t>
+        <w:t xml:space="preserve">ABB Motion Business Area President Brandon Spencer on Infinitus, ABB’s new direct-current portfolio for AI data centers, and rack-level power demand climbing toward roughly one megawatt per rack – five to six times today’s levels.</w:t>
       </w:r>
     </w:p>
     <w:p>
@@ -528,6 +482,9 @@
         <w:spacing w:after="0" w:line="240" w:lineRule="auto"/>
       </w:pPr>
       <w:r>
+        <w:t xml:space="preserve">November 7 | </w:t>
+      </w:r>
+      <w:r>
         <w:rPr>
           <w:i/>
           <w:iCs/>
@@ -535,18 +492,17 @@
         <w:t xml:space="preserve">The Visioneers with Zay Harding</w:t>
       </w:r>
       <w:r>
-        <w:t xml:space="preserve">: ABB Vice President of Strategic Partnerships Chris Shigas takes CBS’s weekly eco-innovation series inside the NASCAR EV prototype | CBS (November 7, 2026)</w:t>
-      </w:r>
-    </w:p>
-    <w:p>
-      <w:pPr>
-        <w:spacing w:after="0" w:line="240" w:lineRule="auto"/>
-      </w:pPr>
-    </w:p>
-    <w:p>
-      <w:pPr>
-        <w:spacing w:after="0" w:line="240" w:lineRule="auto"/>
-        <w:jc w:val="center"/>
+        <w:t xml:space="preserve">: ABB Vice President of Strategic Partnerships Chris Shigas takes the CBS eco-innovation series inside the ABB NASCAR EV Prototype | CBS</w:t>
+      </w:r>
+    </w:p>
+    <w:p>
+      <w:pPr>
+        <w:spacing w:after="0" w:line="240" w:lineRule="auto"/>
+      </w:pPr>
+    </w:p>
+    <w:p>
+      <w:pPr>
+        <w:spacing w:after="0" w:line="240" w:lineRule="auto"/>
       </w:pPr>
       <w:r>
         <w:rPr>

</xml_diff>

<commit_message>
docs: answer Ryan's note on what the Albuquerque plant makes
Takes the revised Heinrich paragraph as written and adds two short
paragraphs naming the products and tying them to electrification:
Elastimold separable connectors, terminations, splices, grounding
devices and surge arresters, plus Fisher Pierce faulted circuit
indicators and sensors, which ABB manufactures in Albuquerque.

Co-Authored-By: Claude Opus 5 <noreply@anthropic.com>
Claude-Session: https://claude.ai/code/session_011q5eW4NuKCCzyAiWXMj3FD
</commit_message>
<xml_diff>
--- a/newsletters/Q4_2026_ABB_Newsletter_Draft.docx
+++ b/newsletters/Q4_2026_ABB_Newsletter_Draft.docx
@@ -87,7 +87,7 @@
       <w:r>
         <w:t xml:space="preserve">On October 12, Senator Martin Heinrich came to ABB’s Elastimold plant in Albuquerque. The Ranking Member of the Senate Energy and Natural Resources Committee </w:t>
       </w:r>
-      <w:hyperlink w:history="1" r:id="rIdjmdkrc5qztuhhyyflgg97">
+      <w:hyperlink w:history="1" r:id="rIdcvvjnfexyzwbsu5r0p76w">
         <w:r>
           <w:rPr>
             <w:rStyle w:val="Hyperlink"/>
@@ -96,20 +96,33 @@
         </w:r>
       </w:hyperlink>
       <w:r>
-        <w:t xml:space="preserve">, then walked the floor through five stations of ABB products. He was making the case for the Bipartisan American Affordability and Jobs Act of 2026, which he introduced with Senators Lee, Capito, and Whitehouse. The bill speeds federal review of energy projects and requires data centers to pay for their own grid upgrades.</w:t>
-      </w:r>
-    </w:p>
-    <w:p>
-      <w:pPr>
-        <w:spacing w:after="0" w:line="240" w:lineRule="auto"/>
-      </w:pPr>
-    </w:p>
-    <w:p>
-      <w:pPr>
-        <w:spacing w:after="0" w:line="240" w:lineRule="auto"/>
-      </w:pPr>
-      <w:r>
-        <w:t xml:space="preserve">“We need permitting reform to put more electrons on the grid,” Heinrich said. “It results in more jobs.”</w:t>
+        <w:t xml:space="preserve"> and walked the floor where he could pick up the hardware and see how it gets built. During the visit he made the case for the Bipartisan American Affordability and Jobs Act of 2026, which he introduced with Senators Lee, Capito, and Whitehouse. “We need permitting reform to put more electrons on the grid,” Heinrich said. “It results in more jobs.”</w:t>
+      </w:r>
+    </w:p>
+    <w:p>
+      <w:pPr>
+        <w:spacing w:after="0" w:line="240" w:lineRule="auto"/>
+      </w:pPr>
+    </w:p>
+    <w:p>
+      <w:pPr>
+        <w:spacing w:after="0" w:line="240" w:lineRule="auto"/>
+      </w:pPr>
+      <w:r>
+        <w:t xml:space="preserve">That hardware is the connection point itself. Albuquerque builds Elastimold separable connectors – the plug-in joints that tie underground cable into transformers and switchgear on medium-voltage systems – along with terminations, splices, grounding devices, and surge arresters. The site also makes Fisher Pierce faulted circuit indicators and sensors, which tell a utility where a fault is instead of leaving crews to search the line.</w:t>
+      </w:r>
+    </w:p>
+    <w:p>
+      <w:pPr>
+        <w:spacing w:after="0" w:line="240" w:lineRule="auto"/>
+      </w:pPr>
+    </w:p>
+    <w:p>
+      <w:pPr>
+        <w:spacing w:after="0" w:line="240" w:lineRule="auto"/>
+      </w:pPr>
+      <w:r>
+        <w:t xml:space="preserve">Every new data center, factory, and EV depot reaches the grid through equipment like this. It is where new load physically meets the distribution system, and where an outage either spreads or stops. The electrons Heinrich wants on the grid run through parts built in Albuquerque.</w:t>
       </w:r>
     </w:p>
     <w:p>
@@ -124,7 +137,7 @@
       <w:r>
         <w:t xml:space="preserve">Two days later in Senatobia, Mississippi, ABB marked ten years at its circuit breaker factory and </w:t>
       </w:r>
-      <w:hyperlink w:history="1" r:id="rIdkglgk4tmle5ruwc8pqb_q">
+      <w:hyperlink w:history="1" r:id="rIdey0p1g3z3cwfth0rgtfyf">
         <w:r>
           <w:rPr>
             <w:rStyle w:val="Hyperlink"/>
@@ -423,7 +436,7 @@
       <w:r>
         <w:t xml:space="preserve">September 2026 | Bloomberg: </w:t>
       </w:r>
-      <w:hyperlink w:history="1" r:id="rIdimgtp_jdzdddmcquqs6-f">
+      <w:hyperlink w:history="1" r:id="rIdeu5n4jzeucuphv8hmaihr">
         <w:r>
           <w:rPr>
             <w:rStyle w:val="Hyperlink"/>

</xml_diff>

<commit_message>
docs: name the hardware inline instead of in added paragraphs
Reverts the two explanatory paragraphs and expands the existing
sentence instead, naming the Elastimold separable connectors and
Fisher Pierce fault indicators in the clause where the hardware is
already mentioned.

Co-Authored-By: Claude Opus 5 <noreply@anthropic.com>
Claude-Session: https://claude.ai/code/session_011q5eW4NuKCCzyAiWXMj3FD
</commit_message>
<xml_diff>
--- a/newsletters/Q4_2026_ABB_Newsletter_Draft.docx
+++ b/newsletters/Q4_2026_ABB_Newsletter_Draft.docx
@@ -87,7 +87,7 @@
       <w:r>
         <w:t xml:space="preserve">On October 12, Senator Martin Heinrich came to ABB’s Elastimold plant in Albuquerque. The Ranking Member of the Senate Energy and Natural Resources Committee </w:t>
       </w:r>
-      <w:hyperlink w:history="1" r:id="rIdcvvjnfexyzwbsu5r0p76w">
+      <w:hyperlink w:history="1" r:id="rIdyjhchdekclxycxagox42b">
         <w:r>
           <w:rPr>
             <w:rStyle w:val="Hyperlink"/>
@@ -96,33 +96,7 @@
         </w:r>
       </w:hyperlink>
       <w:r>
-        <w:t xml:space="preserve"> and walked the floor where he could pick up the hardware and see how it gets built. During the visit he made the case for the Bipartisan American Affordability and Jobs Act of 2026, which he introduced with Senators Lee, Capito, and Whitehouse. “We need permitting reform to put more electrons on the grid,” Heinrich said. “It results in more jobs.”</w:t>
-      </w:r>
-    </w:p>
-    <w:p>
-      <w:pPr>
-        <w:spacing w:after="0" w:line="240" w:lineRule="auto"/>
-      </w:pPr>
-    </w:p>
-    <w:p>
-      <w:pPr>
-        <w:spacing w:after="0" w:line="240" w:lineRule="auto"/>
-      </w:pPr>
-      <w:r>
-        <w:t xml:space="preserve">That hardware is the connection point itself. Albuquerque builds Elastimold separable connectors – the plug-in joints that tie underground cable into transformers and switchgear on medium-voltage systems – along with terminations, splices, grounding devices, and surge arresters. The site also makes Fisher Pierce faulted circuit indicators and sensors, which tell a utility where a fault is instead of leaving crews to search the line.</w:t>
-      </w:r>
-    </w:p>
-    <w:p>
-      <w:pPr>
-        <w:spacing w:after="0" w:line="240" w:lineRule="auto"/>
-      </w:pPr>
-    </w:p>
-    <w:p>
-      <w:pPr>
-        <w:spacing w:after="0" w:line="240" w:lineRule="auto"/>
-      </w:pPr>
-      <w:r>
-        <w:t xml:space="preserve">Every new data center, factory, and EV depot reaches the grid through equipment like this. It is where new load physically meets the distribution system, and where an outage either spreads or stops. The electrons Heinrich wants on the grid run through parts built in Albuquerque.</w:t>
+        <w:t xml:space="preserve"> and walked the floor where he could pick up the hardware – the Elastimold separable connectors that tie underground cable into transformers and switchgear, and the Fisher Pierce fault indicators that show utilities where an outage starts – and see how it gets built. During the visit he made the case for the Bipartisan American Affordability and Jobs Act of 2026, which he introduced with Senators Lee, Capito, and Whitehouse. “We need permitting reform to put more electrons on the grid,” Heinrich said. “It results in more jobs.”</w:t>
       </w:r>
     </w:p>
     <w:p>
@@ -137,7 +111,7 @@
       <w:r>
         <w:t xml:space="preserve">Two days later in Senatobia, Mississippi, ABB marked ten years at its circuit breaker factory and </w:t>
       </w:r>
-      <w:hyperlink w:history="1" r:id="rIdey0p1g3z3cwfth0rgtfyf">
+      <w:hyperlink w:history="1" r:id="rIdgc8vn1oml27rylj97w7ml">
         <w:r>
           <w:rPr>
             <w:rStyle w:val="Hyperlink"/>
@@ -436,7 +410,7 @@
       <w:r>
         <w:t xml:space="preserve">September 2026 | Bloomberg: </w:t>
       </w:r>
-      <w:hyperlink w:history="1" r:id="rIdeu5n4jzeucuphv8hmaihr">
+      <w:hyperlink w:history="1" r:id="rIdnf4y-uwfmwdnmjqrpyryq">
         <w:r>
           <w:rPr>
             <w:rStyle w:val="Hyperlink"/>

</xml_diff>